<commit_message>
docs(cifie): rewrite Resumen section as an engaging TLDR introduction to XAI
</commit_message>
<xml_diff>
--- a/publications/book_chapters/2026_cifie_xai_fom7/drafts/v3_editorial_review/cifie_xai_fom7_2026-10-05.docx
+++ b/publications/book_chapters/2026_cifie_xai_fom7/drafts/v3_editorial_review/cifie_xai_fom7_2026-10-05.docx
@@ -66,7 +66,99 @@
         <w:rPr>
           <w:color w:val="000000"/>
         </w:rPr>
-        <w:t xml:space="preserve">La explicabilidad en inteligencia artificial suele presentarse como respuesta a la opacidad de los modelos de aprendizaje automático, pero producir explicaciones no equivale a demostrar que esas explicaciones sean fieles, estables, comparables o técnicamente defendibles. Este capítulo aborda esa brecha mediante FOM-7, un protocolo operativo de siete puertas para convertir el benchmarking de métodos post-hoc en evidencia reproducible, multi-métrica y auditable. El capítulo integra fundamentos de XAI, una crítica a la crisis de evaluación y un benchmark empírico sobre el conjunto de datos UCI Adult Income que compara LIME, SHAP, Anchors y DiCE en cinco familias de modelos, cinco semillas y tres tamaños de muestra. Tras la auditoría de artefactos, el análisis utiliza 275 celdas calificadas y pruebas no paramétricas con control de multiplicidad. Los resultados muestran diferencias globales significativas en fidelidad y estabilidad; SHAP presenta el perfil más fuerte para auditoría técnica, mientras LIME, frente a SHAP, suele ser más barato y más conciso, con una limitación crítica de estabilidad. Anchors y DiCE requieren lectura diferenciada porque producen reglas y contrafactuales, no solo atribuciones de características. La contribución central es metodológica: desplazar la evaluación XAI desde rankings aislados hacia perfiles explicativos trazables, delimitados por objetivo, métrica, evidencia y alcance.</w:t>
+        <w:t xml:space="preserve">A medida que los sistemas de inteligencia artificial asumen decisiones críticas en la salud, las finanzas y la sociedad, entender</w:t>
+      </w:r>
+      <w:r>
+        <w:rPr>
+          <w:color w:val="000000"/>
+        </w:rPr>
+        <w:t xml:space="preserve"> </w:t>
+      </w:r>
+      <w:r>
+        <w:rPr>
+          <w:i/>
+          <w:iCs/>
+          <w:color w:val="000000"/>
+        </w:rPr>
+        <w:t xml:space="preserve">por qué</w:t>
+      </w:r>
+      <w:r>
+        <w:rPr>
+          <w:color w:val="000000"/>
+        </w:rPr>
+        <w:t xml:space="preserve"> </w:t>
+      </w:r>
+      <w:r>
+        <w:rPr>
+          <w:color w:val="000000"/>
+        </w:rPr>
+        <w:t xml:space="preserve">un modelo toma una determinación ya no es solo una curiosidad técnica: es una necesidad ética, legal y operativa. Sin embargo, generar una explicación no garantiza que esta sea confiable. Herramientas populares como LIME, SHAP, Anchors o DiCE a menudo ofrecen respuestas divergentes ante un mismo problema, lo que plantea una pregunta crucial: ¿cómo evaluar si la explicación misma es digna de confianza?</w:t>
+      </w:r>
+    </w:p>
+    <w:p>
+      <w:pPr>
+        <w:pStyle w:val="BodyText"/>
+        <w:spacing w:line="360" w:lineRule="auto"/>
+        <w:jc w:val="both"/>
+      </w:pPr>
+      <w:r>
+        <w:rPr>
+          <w:color w:val="000000"/>
+        </w:rPr>
+        <w:t xml:space="preserve">Este capítulo ofrece una visión introductoria y rigurosa sobre la Inteligencia Artificial Explicable (XAI) a través de</w:t>
+      </w:r>
+      <w:r>
+        <w:rPr>
+          <w:color w:val="000000"/>
+        </w:rPr>
+        <w:t xml:space="preserve"> </w:t>
+      </w:r>
+      <w:r>
+        <w:rPr>
+          <w:b/>
+          <w:bCs/>
+          <w:color w:val="000000"/>
+        </w:rPr>
+        <w:t xml:space="preserve">FOM-7</w:t>
+      </w:r>
+      <w:r>
+        <w:rPr>
+          <w:color w:val="000000"/>
+        </w:rPr>
+        <w:t xml:space="preserve">, un protocolo operativo de siete puertas diseñado para auditar, comparar y validar explicaciones algorítmicas de manera reproducible. A partir de un benchmark empírico sobre el conjunto de datos</w:t>
+      </w:r>
+      <w:r>
+        <w:rPr>
+          <w:color w:val="000000"/>
+        </w:rPr>
+        <w:t xml:space="preserve"> </w:t>
+      </w:r>
+      <w:r>
+        <w:rPr>
+          <w:i/>
+          <w:iCs/>
+          <w:color w:val="000000"/>
+        </w:rPr>
+        <w:t xml:space="preserve">UCI Adult Income</w:t>
+      </w:r>
+      <w:r>
+        <w:rPr>
+          <w:color w:val="000000"/>
+        </w:rPr>
+        <w:t xml:space="preserve">, el texto analiza cómo responden LIME, SHAP, Anchors y DiCE al evaluar cinco familias de modelos predictivos. El análisis revela el perfil de cada método —mostrando la solidez de SHAP para auditorías de alta exigencia frente a la velocidad pero menor estabilidad de LIME, así como el valor práctico de las reglas de Anchors y los escenarios contrafactuales de DiCE.</w:t>
+      </w:r>
+    </w:p>
+    <w:p>
+      <w:pPr>
+        <w:pStyle w:val="BodyText"/>
+        <w:spacing w:line="360" w:lineRule="auto"/>
+        <w:jc w:val="both"/>
+      </w:pPr>
+      <w:r>
+        <w:rPr>
+          <w:color w:val="000000"/>
+        </w:rPr>
+        <w:t xml:space="preserve">Más que un listado de métricas, este capítulo proporciona al lector una hoja de ruta clara para transitar desde la confianza ciega en los algoritmos hacia una supervisión transparente, defendible y centrada en el ser humano.</w:t>
       </w:r>
     </w:p>
     <w:bookmarkEnd w:id="9"/>

</xml_diff>

<commit_message>
docs(cifie): join second and third paragraphs in Resumen with punto y seguido
</commit_message>
<xml_diff>
--- a/publications/book_chapters/2026_cifie_xai_fom7/drafts/v3_editorial_review/cifie_xai_fom7_2026-10-05.docx
+++ b/publications/book_chapters/2026_cifie_xai_fom7/drafts/v3_editorial_review/cifie_xai_fom7_2026-10-05.docx
@@ -145,20 +145,7 @@
         <w:rPr>
           <w:color w:val="000000"/>
         </w:rPr>
-        <w:t xml:space="preserve">, el texto analiza cómo responden LIME, SHAP, Anchors y DiCE al evaluar cinco familias de modelos predictivos. El análisis revela el perfil de cada método —mostrando la solidez de SHAP para auditorías de alta exigencia frente a la velocidad pero menor estabilidad de LIME, así como el valor práctico de las reglas de Anchors y los escenarios contrafactuales de DiCE.</w:t>
-      </w:r>
-    </w:p>
-    <w:p>
-      <w:pPr>
-        <w:pStyle w:val="BodyText"/>
-        <w:spacing w:line="360" w:lineRule="auto"/>
-        <w:jc w:val="both"/>
-      </w:pPr>
-      <w:r>
-        <w:rPr>
-          <w:color w:val="000000"/>
-        </w:rPr>
-        <w:t xml:space="preserve">Más que un listado de métricas, este capítulo proporciona al lector una hoja de ruta clara para transitar desde la confianza ciega en los algoritmos hacia una supervisión transparente, defendible y centrada en el ser humano.</w:t>
+        <w:t xml:space="preserve">, el texto analiza cómo responden LIME, SHAP, Anchors y DiCE al evaluar cinco familias de modelos predictivos. El análisis revela el perfil de cada método —mostrando la solidez de SHAP para auditorías de alta exigencia frente a la velocidad pero menor estabilidad de LIME, así como el valor práctico de las reglas de Anchors y los escenarios contrafactuales de DiCE. Más que un listado de métricas, este capítulo proporciona al lector una hoja de ruta clara para transitar desde la confianza ciega en los algoritmos hacia una supervisión transparente, defendible y centrada en el ser humano.</w:t>
       </w:r>
     </w:p>
     <w:bookmarkEnd w:id="9"/>

</xml_diff>